<commit_message>
feat: finalize QA stage 2 adjustments
</commit_message>
<xml_diff>
--- a/docs/checklist-ajustes-qa-2026-05-28.docx
+++ b/docs/checklist-ajustes-qa-2026-05-28.docx
@@ -1,105 +1,126 @@
 
 <file path=word/document.xml><?xml version="1.0" encoding="utf-8"?>
-<w:document xmlns:w="http://schemas.openxmlformats.org/wordprocessingml/2006/main" xmlns:r="http://schemas.openxmlformats.org/officeDocument/2006/relationships">
+<w:document xmlns:w="http://schemas.openxmlformats.org/wordprocessingml/2006/main">
   <w:body>
     <w:p>
       <w:pPr>
-        <w:pStyle w:val="Title"/>
-        <w:spacing w:before="0" w:after="80" w:line="276" w:lineRule="auto"/>
-      </w:pPr>
-      <w:r>
-        <w:rPr>
-          <w:rFonts w:ascii="Aptos" w:hAnsi="Aptos" w:cs="Aptos"/>
-          <w:sz w:val="44"/>
-          <w:szCs w:val="44"/>
-          <w:b/>
-          <w:bCs/>
-          <w:color w:val="1F2937"/>
-        </w:rPr>
-        <w:t>Checklist de Ajustes QA</w:t>
-      </w:r>
-    </w:p>
-    <w:p>
-      <w:pPr>
-        <w:spacing w:before="0" w:after="220" w:line="276" w:lineRule="auto"/>
-        <w:pBdr>
-          <w:bottom w:val="single" w:sz="6" w:space="8" w:color="D7DEE8"/>
-        </w:pBdr>
-      </w:pPr>
-      <w:r>
-        <w:rPr>
-          <w:rFonts w:ascii="Aptos" w:hAnsi="Aptos" w:cs="Aptos"/>
-          <w:sz w:val="22"/>
-          <w:szCs w:val="22"/>
-          <w:color w:val="64748B"/>
-        </w:rPr>
-        <w:t>Fluxo principal de compra e pós-venda | 28/05/2026</w:t>
-      </w:r>
-    </w:p>
-    <w:p>
-      <w:pPr>
-        <w:spacing w:before="0" w:after="160" w:line="276" w:lineRule="auto"/>
-      </w:pPr>
-      <w:r>
-        <w:rPr>
-          <w:rFonts w:ascii="Aptos" w:hAnsi="Aptos" w:cs="Aptos"/>
-          <w:sz w:val="19"/>
-          <w:szCs w:val="19"/>
-          <w:color w:val="64748B"/>
-        </w:rPr>
-        <w:t xml:space="preserve">Documento de acompanhamento baseado em </w:t>
-      </w:r>
-      <w:r>
-        <w:rPr>
-          <w:rFonts w:ascii="Aptos" w:hAnsi="Aptos" w:cs="Aptos"/>
-          <w:sz w:val="19"/>
-          <w:szCs w:val="19"/>
-          <w:color w:val="2F5FBD"/>
-        </w:rPr>
-        <w:t>docs/plano-ajustes-qa-2026-05-28.md</w:t>
-      </w:r>
-      <w:r>
-        <w:rPr>
-          <w:rFonts w:ascii="Aptos" w:hAnsi="Aptos" w:cs="Aptos"/>
-          <w:sz w:val="19"/>
-          <w:szCs w:val="19"/>
-          <w:color w:val="64748B"/>
-        </w:rPr>
-        <w:t>.</w:t>
-      </w:r>
-    </w:p>
-    <w:p>
-      <w:pPr>
-        <w:spacing w:before="80" w:after="180" w:line="276" w:lineRule="auto"/>
-        <w:ind w:left="180"/>
-        <w:shd w:val="clear" w:color="auto" w:fill="F8FAFC"/>
-      </w:pPr>
-      <w:r>
-        <w:rPr>
-          <w:rFonts w:ascii="Aptos" w:hAnsi="Aptos" w:cs="Aptos"/>
-          <w:sz w:val="19"/>
-          <w:szCs w:val="19"/>
-          <w:b/>
-          <w:bCs/>
-          <w:color w:val="1F2937"/>
-        </w:rPr>
-        <w:t xml:space="preserve">Legenda: </w:t>
-      </w:r>
-      <w:r>
-        <w:rPr>
-          <w:rFonts w:ascii="Aptos" w:hAnsi="Aptos" w:cs="Aptos"/>
-          <w:sz w:val="19"/>
-          <w:szCs w:val="19"/>
-          <w:color w:val="64748B"/>
-        </w:rPr>
-        <w:t>itens concluídos usam apenas o ícone de check; itens pendentes usam quadrado vazio.</w:t>
-      </w:r>
-    </w:p>
-    <w:p>
-      <w:pPr>
-        <w:pStyle w:val="Heading1"/>
-        <w:spacing w:before="220" w:after="130" w:line="276" w:lineRule="auto"/>
-        <w:keepNext/>
+        <w:spacing w:before="0" w:after="240" w:line="276" w:lineRule="auto"/>
+      </w:pPr>
+      <w:r>
+        <w:rPr>
+          <w:rFonts w:ascii="Aptos" w:hAnsi="Aptos" w:cs="Aptos"/>
+          <w:sz w:val="36"/>
+          <w:szCs w:val="36"/>
+          <w:b/>
+          <w:bCs/>
+          <w:color w:val="111827"/>
+        </w:rPr>
+        <w:t xml:space="preserve">Checklist de ajustes QA - 28/05/2026</w:t>
+      </w:r>
+    </w:p>
+    <w:p>
+      <w:pPr>
+        <w:spacing w:after="80"/>
+      </w:pPr>
+    </w:p>
+    <w:p>
+      <w:pPr>
+        <w:spacing w:before="0" w:after="90" w:line="276" w:lineRule="auto"/>
+      </w:pPr>
+      <w:r>
+        <w:rPr>
+          <w:rFonts w:ascii="Aptos" w:hAnsi="Aptos" w:cs="Aptos"/>
+          <w:sz w:val="20"/>
+          <w:szCs w:val="20"/>
+          <w:color w:val="374151"/>
+        </w:rPr>
+        <w:t xml:space="preserve">Documento de acompanhamento baseado em docs/plano-ajustes-qa-2026-05-28.md.</w:t>
+      </w:r>
+    </w:p>
+    <w:p>
+      <w:pPr>
+        <w:spacing w:after="80"/>
+      </w:pPr>
+    </w:p>
+    <w:p>
+      <w:pPr>
+        <w:spacing w:before="0" w:after="90" w:line="276" w:lineRule="auto"/>
+      </w:pPr>
+      <w:r>
+        <w:rPr>
+          <w:rFonts w:ascii="Aptos" w:hAnsi="Aptos" w:cs="Aptos"/>
+          <w:sz w:val="20"/>
+          <w:szCs w:val="20"/>
+          <w:color w:val="374151"/>
+        </w:rPr>
+        <w:t xml:space="preserve">Status:</w:t>
+      </w:r>
+    </w:p>
+    <w:p>
+      <w:pPr>
+        <w:spacing w:after="80"/>
+      </w:pPr>
+    </w:p>
+    <w:p>
+      <w:pPr>
+        <w:spacing w:before="8" w:after="76" w:line="276" w:lineRule="auto"/>
+        <w:ind w:left="360" w:hanging="260"/>
+      </w:pPr>
+      <w:r>
+        <w:rPr>
+          <w:rFonts w:ascii="Segoe UI Symbol" w:hAnsi="Segoe UI Symbol" w:cs="Segoe UI Symbol"/>
+          <w:sz w:val="22"/>
+          <w:szCs w:val="22"/>
+          <w:b/>
+          <w:bCs/>
+          <w:color w:val="16803A"/>
+        </w:rPr>
+        <w:t>✓</w:t>
+      </w:r>
+      <w:r>
+        <w:rPr>
+          <w:rFonts w:ascii="Aptos" w:hAnsi="Aptos" w:cs="Aptos"/>
+          <w:sz w:val="20"/>
+          <w:szCs w:val="20"/>
+          <w:color w:val="1F2937"/>
+        </w:rPr>
+        <w:t xml:space="preserve">  Feito e testado.</w:t>
+      </w:r>
+    </w:p>
+    <w:p>
+      <w:pPr>
+        <w:spacing w:before="8" w:after="76" w:line="276" w:lineRule="auto"/>
+        <w:ind w:left="360" w:hanging="260"/>
+      </w:pPr>
+      <w:r>
+        <w:rPr>
+          <w:rFonts w:ascii="Segoe UI Symbol" w:hAnsi="Segoe UI Symbol" w:cs="Segoe UI Symbol"/>
+          <w:sz w:val="22"/>
+          <w:szCs w:val="22"/>
+          <w:b/>
+          <w:bCs/>
+          <w:color w:val="94A3B8"/>
+        </w:rPr>
+        <w:t>□</w:t>
+      </w:r>
+      <w:r>
+        <w:rPr>
+          <w:rFonts w:ascii="Aptos" w:hAnsi="Aptos" w:cs="Aptos"/>
+          <w:sz w:val="20"/>
+          <w:szCs w:val="20"/>
+          <w:color w:val="1F2937"/>
+        </w:rPr>
+        <w:t xml:space="preserve">  Pendente.</w:t>
+      </w:r>
+    </w:p>
+    <w:p>
+      <w:pPr>
+        <w:spacing w:after="80"/>
+      </w:pPr>
+    </w:p>
+    <w:p>
+      <w:pPr>
+        <w:spacing w:before="280" w:after="120" w:line="276" w:lineRule="auto"/>
       </w:pPr>
       <w:r>
         <w:rPr>
@@ -108,10 +129,15 @@
           <w:szCs w:val="28"/>
           <w:b/>
           <w:bCs/>
-          <w:color w:val="1F2937"/>
-        </w:rPr>
-        <w:t>Resumo executivo</w:t>
-      </w:r>
+          <w:color w:val="1D4ED8"/>
+        </w:rPr>
+        <w:t xml:space="preserve">Resumo executivo</w:t>
+      </w:r>
+    </w:p>
+    <w:p>
+      <w:pPr>
+        <w:spacing w:after="80"/>
+      </w:pPr>
     </w:p>
     <w:p>
       <w:pPr>
@@ -177,18 +203,18 @@
           <w:szCs w:val="22"/>
           <w:b/>
           <w:bCs/>
-          <w:color w:val="94A3B8"/>
-        </w:rPr>
-        <w:t>□</w:t>
-      </w:r>
-      <w:r>
-        <w:rPr>
-          <w:rFonts w:ascii="Aptos" w:hAnsi="Aptos" w:cs="Aptos"/>
-          <w:sz w:val="20"/>
-          <w:szCs w:val="20"/>
-          <w:color w:val="1F2937"/>
-        </w:rPr>
-        <w:t xml:space="preserve">  Etapa 2 pendente: busca, checkout e estados visuais.</w:t>
+          <w:color w:val="16803A"/>
+        </w:rPr>
+        <w:t>✓</w:t>
+      </w:r>
+      <w:r>
+        <w:rPr>
+          <w:rFonts w:ascii="Aptos" w:hAnsi="Aptos" w:cs="Aptos"/>
+          <w:sz w:val="20"/>
+          <w:szCs w:val="20"/>
+          <w:color w:val="1F2937"/>
+        </w:rPr>
+        <w:t xml:space="preserve">  Etapa 2 concluída: busca, checkout e estados visuais.</w:t>
       </w:r>
     </w:p>
     <w:p>
@@ -271,9 +297,12 @@
     </w:p>
     <w:p>
       <w:pPr>
-        <w:pStyle w:val="Heading1"/>
-        <w:spacing w:before="220" w:after="130" w:line="276" w:lineRule="auto"/>
-        <w:keepNext/>
+        <w:spacing w:after="80"/>
+      </w:pPr>
+    </w:p>
+    <w:p>
+      <w:pPr>
+        <w:spacing w:before="280" w:after="120" w:line="276" w:lineRule="auto"/>
       </w:pPr>
       <w:r>
         <w:rPr>
@@ -282,44 +311,55 @@
           <w:szCs w:val="28"/>
           <w:b/>
           <w:bCs/>
-          <w:color w:val="1F2937"/>
-        </w:rPr>
-        <w:t>Etapa 1 - Textos, labels e pequenos ajustes de UI</w:t>
-      </w:r>
-    </w:p>
-    <w:p>
-      <w:pPr>
-        <w:spacing w:before="0" w:after="140" w:line="276" w:lineRule="auto"/>
-      </w:pPr>
-      <w:r>
-        <w:rPr>
-          <w:rFonts w:ascii="Aptos" w:hAnsi="Aptos" w:cs="Aptos"/>
-          <w:sz w:val="19"/>
-          <w:szCs w:val="19"/>
-          <w:i/>
-          <w:iCs/>
-          <w:color w:val="64748B"/>
-        </w:rPr>
-        <w:t>Objetivo: corrigir comunicação e elementos visuais sem alterar regras profundas.</w:t>
-      </w:r>
-    </w:p>
-    <w:p>
-      <w:pPr>
-        <w:pStyle w:val="Heading2"/>
+          <w:color w:val="1D4ED8"/>
+        </w:rPr>
+        <w:t xml:space="preserve">Etapa 1 - Textos, labels e pequenos ajustes de UI</w:t>
+      </w:r>
+    </w:p>
+    <w:p>
+      <w:pPr>
+        <w:spacing w:after="80"/>
+      </w:pPr>
+    </w:p>
+    <w:p>
+      <w:pPr>
+        <w:spacing w:before="0" w:after="90" w:line="276" w:lineRule="auto"/>
+      </w:pPr>
+      <w:r>
+        <w:rPr>
+          <w:rFonts w:ascii="Aptos" w:hAnsi="Aptos" w:cs="Aptos"/>
+          <w:sz w:val="20"/>
+          <w:szCs w:val="20"/>
+          <w:color w:val="374151"/>
+        </w:rPr>
+        <w:t xml:space="preserve">Objetivo: corrigir comunicação e elementos visuais sem alterar regras profundas.</w:t>
+      </w:r>
+    </w:p>
+    <w:p>
+      <w:pPr>
+        <w:spacing w:after="80"/>
+      </w:pPr>
+    </w:p>
+    <w:p>
+      <w:pPr>
         <w:spacing w:before="180" w:after="90" w:line="276" w:lineRule="auto"/>
-        <w:keepNext/>
-      </w:pPr>
-      <w:r>
-        <w:rPr>
-          <w:rFonts w:ascii="Aptos" w:hAnsi="Aptos" w:cs="Aptos"/>
-          <w:sz w:val="22"/>
-          <w:szCs w:val="22"/>
-          <w:b/>
-          <w:bCs/>
-          <w:color w:val="2F5FBD"/>
-        </w:rPr>
-        <w:t>Implementação</w:t>
-      </w:r>
+      </w:pPr>
+      <w:r>
+        <w:rPr>
+          <w:rFonts w:ascii="Aptos" w:hAnsi="Aptos" w:cs="Aptos"/>
+          <w:sz w:val="22"/>
+          <w:szCs w:val="22"/>
+          <w:b/>
+          <w:bCs/>
+          <w:color w:val="374151"/>
+        </w:rPr>
+        <w:t xml:space="preserve">Implementação</w:t>
+      </w:r>
+    </w:p>
+    <w:p>
+      <w:pPr>
+        <w:spacing w:after="80"/>
+      </w:pPr>
     </w:p>
     <w:p>
       <w:pPr>
@@ -480,7 +520,7 @@
     <w:p>
       <w:pPr>
         <w:spacing w:before="8" w:after="76" w:line="276" w:lineRule="auto"/>
-        <w:ind w:left="720" w:hanging="260"/>
+        <w:ind w:left="360" w:hanging="260"/>
       </w:pPr>
       <w:r>
         <w:rPr>
@@ -506,7 +546,7 @@
     <w:p>
       <w:pPr>
         <w:spacing w:before="8" w:after="76" w:line="276" w:lineRule="auto"/>
-        <w:ind w:left="720" w:hanging="260"/>
+        <w:ind w:left="360" w:hanging="260"/>
       </w:pPr>
       <w:r>
         <w:rPr>
@@ -687,21 +727,29 @@
     </w:p>
     <w:p>
       <w:pPr>
-        <w:pStyle w:val="Heading2"/>
+        <w:spacing w:after="80"/>
+      </w:pPr>
+    </w:p>
+    <w:p>
+      <w:pPr>
         <w:spacing w:before="180" w:after="90" w:line="276" w:lineRule="auto"/>
-        <w:keepNext/>
-      </w:pPr>
-      <w:r>
-        <w:rPr>
-          <w:rFonts w:ascii="Aptos" w:hAnsi="Aptos" w:cs="Aptos"/>
-          <w:sz w:val="22"/>
-          <w:szCs w:val="22"/>
-          <w:b/>
-          <w:bCs/>
-          <w:color w:val="2F5FBD"/>
-        </w:rPr>
-        <w:t>Testes e validações</w:t>
-      </w:r>
+      </w:pPr>
+      <w:r>
+        <w:rPr>
+          <w:rFonts w:ascii="Aptos" w:hAnsi="Aptos" w:cs="Aptos"/>
+          <w:sz w:val="22"/>
+          <w:szCs w:val="22"/>
+          <w:b/>
+          <w:bCs/>
+          <w:color w:val="374151"/>
+        </w:rPr>
+        <w:t xml:space="preserve">Testes e validações</w:t>
+      </w:r>
+    </w:p>
+    <w:p>
+      <w:pPr>
+        <w:spacing w:after="80"/>
+      </w:pPr>
     </w:p>
     <w:p>
       <w:pPr>
@@ -991,21 +1039,29 @@
     </w:p>
     <w:p>
       <w:pPr>
-        <w:pStyle w:val="Heading2"/>
+        <w:spacing w:after="80"/>
+      </w:pPr>
+    </w:p>
+    <w:p>
+      <w:pPr>
         <w:spacing w:before="180" w:after="90" w:line="276" w:lineRule="auto"/>
-        <w:keepNext/>
-      </w:pPr>
-      <w:r>
-        <w:rPr>
-          <w:rFonts w:ascii="Aptos" w:hAnsi="Aptos" w:cs="Aptos"/>
-          <w:sz w:val="22"/>
-          <w:szCs w:val="22"/>
-          <w:b/>
-          <w:bCs/>
-          <w:color w:val="2F5FBD"/>
-        </w:rPr>
-        <w:t>Evidências da etapa 1</w:t>
-      </w:r>
+      </w:pPr>
+      <w:r>
+        <w:rPr>
+          <w:rFonts w:ascii="Aptos" w:hAnsi="Aptos" w:cs="Aptos"/>
+          <w:sz w:val="22"/>
+          <w:szCs w:val="22"/>
+          <w:b/>
+          <w:bCs/>
+          <w:color w:val="374151"/>
+        </w:rPr>
+        <w:t xml:space="preserve">Evidências da etapa 1</w:t>
+      </w:r>
+    </w:p>
+    <w:p>
+      <w:pPr>
+        <w:spacing w:after="80"/>
+      </w:pPr>
     </w:p>
     <w:p>
       <w:pPr>
@@ -1035,109 +1091,144 @@
     </w:p>
     <w:p>
       <w:pPr>
-        <w:spacing w:before="8" w:after="76" w:line="276" w:lineRule="auto"/>
-        <w:ind w:left="360" w:hanging="260"/>
-      </w:pPr>
-      <w:r>
-        <w:rPr>
-          <w:rFonts w:ascii="Segoe UI Symbol" w:hAnsi="Segoe UI Symbol" w:cs="Segoe UI Symbol"/>
-          <w:sz w:val="22"/>
-          <w:szCs w:val="22"/>
-          <w:b/>
-          <w:bCs/>
-          <w:color w:val="16803A"/>
-        </w:rPr>
-        <w:t>✓</w:t>
-      </w:r>
-      <w:r>
-        <w:rPr>
-          <w:rFonts w:ascii="Aptos" w:hAnsi="Aptos" w:cs="Aptos"/>
-          <w:sz w:val="20"/>
-          <w:szCs w:val="20"/>
-          <w:color w:val="1F2937"/>
-        </w:rPr>
-        <w:t xml:space="preserve">  Suíte completa PHPUnit executada:</w:t>
-      </w:r>
-    </w:p>
-    <w:p>
-      <w:pPr>
         <w:spacing w:before="0" w:after="70" w:line="276" w:lineRule="auto"/>
-        <w:ind w:left="720" w:hanging="240"/>
-      </w:pPr>
-      <w:r>
-        <w:rPr>
-          <w:rFonts w:ascii="Aptos" w:hAnsi="Aptos" w:cs="Aptos"/>
+        <w:ind w:left="520"/>
+        <w:shd w:fill="F8FAFC"/>
+      </w:pPr>
+      <w:r>
+        <w:rPr>
+          <w:rFonts w:ascii="Aptos Mono" w:hAnsi="Aptos Mono" w:cs="Aptos Mono"/>
           <w:sz w:val="18"/>
           <w:szCs w:val="18"/>
-          <w:color w:val="2F5FBD"/>
-        </w:rPr>
-        <w:t>•</w:t>
-      </w:r>
-      <w:r>
-        <w:rPr>
-          <w:rFonts w:ascii="Aptos" w:hAnsi="Aptos" w:cs="Aptos"/>
-          <w:sz w:val="19"/>
-          <w:szCs w:val="19"/>
-          <w:color w:val="1F2937"/>
-        </w:rPr>
-        <w:t xml:space="preserve">  Resultado: 263 tests, 1819 assertions</w:t>
-      </w:r>
-    </w:p>
-    <w:p>
-      <w:pPr>
-        <w:spacing w:before="8" w:after="76" w:line="276" w:lineRule="auto"/>
-        <w:ind w:left="360" w:hanging="260"/>
-      </w:pPr>
-      <w:r>
-        <w:rPr>
-          <w:rFonts w:ascii="Segoe UI Symbol" w:hAnsi="Segoe UI Symbol" w:cs="Segoe UI Symbol"/>
-          <w:sz w:val="22"/>
-          <w:szCs w:val="22"/>
-          <w:b/>
-          <w:bCs/>
-          <w:color w:val="16803A"/>
-        </w:rPr>
-        <w:t>✓</w:t>
-      </w:r>
-      <w:r>
-        <w:rPr>
-          <w:rFonts w:ascii="Aptos" w:hAnsi="Aptos" w:cs="Aptos"/>
-          <w:sz w:val="20"/>
-          <w:szCs w:val="20"/>
-          <w:color w:val="1F2937"/>
-        </w:rPr>
-        <w:t xml:space="preserve">  Playwright executado:</w:t>
+          <w:color w:val="334155"/>
+        </w:rPr>
+        <w:t xml:space="preserve">php -d memory_limit=-1 vendor/bin/pint --dirty</w:t>
+      </w:r>
+    </w:p>
+    <w:p>
+      <w:pPr>
+        <w:spacing w:before="8" w:after="76" w:line="276" w:lineRule="auto"/>
+        <w:ind w:left="360" w:hanging="260"/>
+      </w:pPr>
+      <w:r>
+        <w:rPr>
+          <w:rFonts w:ascii="Segoe UI Symbol" w:hAnsi="Segoe UI Symbol" w:cs="Segoe UI Symbol"/>
+          <w:sz w:val="22"/>
+          <w:szCs w:val="22"/>
+          <w:b/>
+          <w:bCs/>
+          <w:color w:val="16803A"/>
+        </w:rPr>
+        <w:t>✓</w:t>
+      </w:r>
+      <w:r>
+        <w:rPr>
+          <w:rFonts w:ascii="Aptos" w:hAnsi="Aptos" w:cs="Aptos"/>
+          <w:sz w:val="20"/>
+          <w:szCs w:val="20"/>
+          <w:color w:val="1F2937"/>
+        </w:rPr>
+        <w:t xml:space="preserve">  Suíte completa PHPUnit executada:</w:t>
       </w:r>
     </w:p>
     <w:p>
       <w:pPr>
         <w:spacing w:before="0" w:after="70" w:line="276" w:lineRule="auto"/>
-        <w:ind w:left="720" w:hanging="240"/>
-      </w:pPr>
-      <w:r>
-        <w:rPr>
-          <w:rFonts w:ascii="Aptos" w:hAnsi="Aptos" w:cs="Aptos"/>
+        <w:ind w:left="520"/>
+        <w:shd w:fill="F8FAFC"/>
+      </w:pPr>
+      <w:r>
+        <w:rPr>
+          <w:rFonts w:ascii="Aptos Mono" w:hAnsi="Aptos Mono" w:cs="Aptos Mono"/>
           <w:sz w:val="18"/>
           <w:szCs w:val="18"/>
-          <w:color w:val="2F5FBD"/>
-        </w:rPr>
-        <w:t>•</w:t>
-      </w:r>
-      <w:r>
-        <w:rPr>
-          <w:rFonts w:ascii="Aptos" w:hAnsi="Aptos" w:cs="Aptos"/>
-          <w:sz w:val="19"/>
-          <w:szCs w:val="19"/>
-          <w:color w:val="1F2937"/>
-        </w:rPr>
-        <w:t xml:space="preserve">  Resultado: 2 passed</w:t>
-      </w:r>
-    </w:p>
-    <w:p>
-      <w:pPr>
-        <w:pStyle w:val="Heading1"/>
-        <w:spacing w:before="220" w:after="130" w:line="276" w:lineRule="auto"/>
-        <w:keepNext/>
+          <w:color w:val="334155"/>
+        </w:rPr>
+        <w:t xml:space="preserve">php -d memory_limit=-1 vendor/bin/phpunit --stop-on-failure</w:t>
+      </w:r>
+    </w:p>
+    <w:p>
+      <w:pPr>
+        <w:spacing w:before="0" w:after="70" w:line="276" w:lineRule="auto"/>
+        <w:ind w:left="520"/>
+        <w:shd w:fill="F8FAFC"/>
+      </w:pPr>
+      <w:r>
+        <w:rPr>
+          <w:rFonts w:ascii="Aptos Mono" w:hAnsi="Aptos Mono" w:cs="Aptos Mono"/>
+          <w:sz w:val="18"/>
+          <w:szCs w:val="18"/>
+          <w:color w:val="334155"/>
+        </w:rPr>
+        <w:t xml:space="preserve">Resultado: 263 tests, 1819 assertions</w:t>
+      </w:r>
+    </w:p>
+    <w:p>
+      <w:pPr>
+        <w:spacing w:before="8" w:after="76" w:line="276" w:lineRule="auto"/>
+        <w:ind w:left="360" w:hanging="260"/>
+      </w:pPr>
+      <w:r>
+        <w:rPr>
+          <w:rFonts w:ascii="Segoe UI Symbol" w:hAnsi="Segoe UI Symbol" w:cs="Segoe UI Symbol"/>
+          <w:sz w:val="22"/>
+          <w:szCs w:val="22"/>
+          <w:b/>
+          <w:bCs/>
+          <w:color w:val="16803A"/>
+        </w:rPr>
+        <w:t>✓</w:t>
+      </w:r>
+      <w:r>
+        <w:rPr>
+          <w:rFonts w:ascii="Aptos" w:hAnsi="Aptos" w:cs="Aptos"/>
+          <w:sz w:val="20"/>
+          <w:szCs w:val="20"/>
+          <w:color w:val="1F2937"/>
+        </w:rPr>
+        <w:t xml:space="preserve">  Playwright executado:</w:t>
+      </w:r>
+    </w:p>
+    <w:p>
+      <w:pPr>
+        <w:spacing w:before="0" w:after="70" w:line="276" w:lineRule="auto"/>
+        <w:ind w:left="520"/>
+        <w:shd w:fill="F8FAFC"/>
+      </w:pPr>
+      <w:r>
+        <w:rPr>
+          <w:rFonts w:ascii="Aptos Mono" w:hAnsi="Aptos Mono" w:cs="Aptos Mono"/>
+          <w:sz w:val="18"/>
+          <w:szCs w:val="18"/>
+          <w:color w:val="334155"/>
+        </w:rPr>
+        <w:t xml:space="preserve">npx playwright test tests/e2e/stage1-ui.spec.ts --project=chromium</w:t>
+      </w:r>
+    </w:p>
+    <w:p>
+      <w:pPr>
+        <w:spacing w:before="0" w:after="70" w:line="276" w:lineRule="auto"/>
+        <w:ind w:left="520"/>
+        <w:shd w:fill="F8FAFC"/>
+      </w:pPr>
+      <w:r>
+        <w:rPr>
+          <w:rFonts w:ascii="Aptos Mono" w:hAnsi="Aptos Mono" w:cs="Aptos Mono"/>
+          <w:sz w:val="18"/>
+          <w:szCs w:val="18"/>
+          <w:color w:val="334155"/>
+        </w:rPr>
+        <w:t xml:space="preserve">Resultado: 2 passed</w:t>
+      </w:r>
+    </w:p>
+    <w:p>
+      <w:pPr>
+        <w:spacing w:after="80"/>
+      </w:pPr>
+    </w:p>
+    <w:p>
+      <w:pPr>
+        <w:spacing w:before="280" w:after="120" w:line="276" w:lineRule="auto"/>
       </w:pPr>
       <w:r>
         <w:rPr>
@@ -1146,60 +1237,71 @@
           <w:szCs w:val="28"/>
           <w:b/>
           <w:bCs/>
-          <w:color w:val="1F2937"/>
-        </w:rPr>
-        <w:t>Etapa 2 - Busca, checkout e estados visuais</w:t>
-      </w:r>
-    </w:p>
-    <w:p>
-      <w:pPr>
-        <w:spacing w:before="0" w:after="140" w:line="276" w:lineRule="auto"/>
-      </w:pPr>
-      <w:r>
-        <w:rPr>
-          <w:rFonts w:ascii="Aptos" w:hAnsi="Aptos" w:cs="Aptos"/>
-          <w:sz w:val="19"/>
-          <w:szCs w:val="19"/>
-          <w:i/>
-          <w:iCs/>
-          <w:color w:val="64748B"/>
-        </w:rPr>
-        <w:t>Objetivo: corrigir navegação e deixar o fluxo visual mais claro.</w:t>
-      </w:r>
-    </w:p>
-    <w:p>
-      <w:pPr>
-        <w:pStyle w:val="Heading2"/>
+          <w:color w:val="1D4ED8"/>
+        </w:rPr>
+        <w:t xml:space="preserve">Etapa 2 - Busca, checkout e estados visuais</w:t>
+      </w:r>
+    </w:p>
+    <w:p>
+      <w:pPr>
+        <w:spacing w:after="80"/>
+      </w:pPr>
+    </w:p>
+    <w:p>
+      <w:pPr>
+        <w:spacing w:before="0" w:after="90" w:line="276" w:lineRule="auto"/>
+      </w:pPr>
+      <w:r>
+        <w:rPr>
+          <w:rFonts w:ascii="Aptos" w:hAnsi="Aptos" w:cs="Aptos"/>
+          <w:sz w:val="20"/>
+          <w:szCs w:val="20"/>
+          <w:color w:val="374151"/>
+        </w:rPr>
+        <w:t xml:space="preserve">Objetivo: corrigir navegação e deixar o fluxo visual mais claro.</w:t>
+      </w:r>
+    </w:p>
+    <w:p>
+      <w:pPr>
+        <w:spacing w:after="80"/>
+      </w:pPr>
+    </w:p>
+    <w:p>
+      <w:pPr>
         <w:spacing w:before="180" w:after="90" w:line="276" w:lineRule="auto"/>
-        <w:keepNext/>
-      </w:pPr>
-      <w:r>
-        <w:rPr>
-          <w:rFonts w:ascii="Aptos" w:hAnsi="Aptos" w:cs="Aptos"/>
-          <w:sz w:val="22"/>
-          <w:szCs w:val="22"/>
-          <w:b/>
-          <w:bCs/>
-          <w:color w:val="2F5FBD"/>
-        </w:rPr>
-        <w:t>Implementação</w:t>
-      </w:r>
-    </w:p>
-    <w:p>
-      <w:pPr>
-        <w:spacing w:before="8" w:after="76" w:line="276" w:lineRule="auto"/>
-        <w:ind w:left="360" w:hanging="260"/>
-      </w:pPr>
-      <w:r>
-        <w:rPr>
-          <w:rFonts w:ascii="Segoe UI Symbol" w:hAnsi="Segoe UI Symbol" w:cs="Segoe UI Symbol"/>
-          <w:sz w:val="22"/>
-          <w:szCs w:val="22"/>
-          <w:b/>
-          <w:bCs/>
-          <w:color w:val="94A3B8"/>
-        </w:rPr>
-        <w:t>□</w:t>
+      </w:pPr>
+      <w:r>
+        <w:rPr>
+          <w:rFonts w:ascii="Aptos" w:hAnsi="Aptos" w:cs="Aptos"/>
+          <w:sz w:val="22"/>
+          <w:szCs w:val="22"/>
+          <w:b/>
+          <w:bCs/>
+          <w:color w:val="374151"/>
+        </w:rPr>
+        <w:t xml:space="preserve">Implementação</w:t>
+      </w:r>
+    </w:p>
+    <w:p>
+      <w:pPr>
+        <w:spacing w:after="80"/>
+      </w:pPr>
+    </w:p>
+    <w:p>
+      <w:pPr>
+        <w:spacing w:before="8" w:after="76" w:line="276" w:lineRule="auto"/>
+        <w:ind w:left="360" w:hanging="260"/>
+      </w:pPr>
+      <w:r>
+        <w:rPr>
+          <w:rFonts w:ascii="Segoe UI Symbol" w:hAnsi="Segoe UI Symbol" w:cs="Segoe UI Symbol"/>
+          <w:sz w:val="22"/>
+          <w:szCs w:val="22"/>
+          <w:b/>
+          <w:bCs/>
+          <w:color w:val="16803A"/>
+        </w:rPr>
+        <w:t>✓</w:t>
       </w:r>
       <w:r>
         <w:rPr>
@@ -1223,9 +1325,9 @@
           <w:szCs w:val="22"/>
           <w:b/>
           <w:bCs/>
-          <w:color w:val="94A3B8"/>
-        </w:rPr>
-        <w:t>□</w:t>
+          <w:color w:val="16803A"/>
+        </w:rPr>
+        <w:t>✓</w:t>
       </w:r>
       <w:r>
         <w:rPr>
@@ -1249,9 +1351,9 @@
           <w:szCs w:val="22"/>
           <w:b/>
           <w:bCs/>
-          <w:color w:val="94A3B8"/>
-        </w:rPr>
-        <w:t>□</w:t>
+          <w:color w:val="16803A"/>
+        </w:rPr>
+        <w:t>✓</w:t>
       </w:r>
       <w:r>
         <w:rPr>
@@ -1275,9 +1377,9 @@
           <w:szCs w:val="22"/>
           <w:b/>
           <w:bCs/>
-          <w:color w:val="94A3B8"/>
-        </w:rPr>
-        <w:t>□</w:t>
+          <w:color w:val="16803A"/>
+        </w:rPr>
+        <w:t>✓</w:t>
       </w:r>
       <w:r>
         <w:rPr>
@@ -1301,9 +1403,9 @@
           <w:szCs w:val="22"/>
           <w:b/>
           <w:bCs/>
-          <w:color w:val="94A3B8"/>
-        </w:rPr>
-        <w:t>□</w:t>
+          <w:color w:val="16803A"/>
+        </w:rPr>
+        <w:t>✓</w:t>
       </w:r>
       <w:r>
         <w:rPr>
@@ -1327,9 +1429,9 @@
           <w:szCs w:val="22"/>
           <w:b/>
           <w:bCs/>
-          <w:color w:val="94A3B8"/>
-        </w:rPr>
-        <w:t>□</w:t>
+          <w:color w:val="16803A"/>
+        </w:rPr>
+        <w:t>✓</w:t>
       </w:r>
       <w:r>
         <w:rPr>
@@ -1343,37 +1445,45 @@
     </w:p>
     <w:p>
       <w:pPr>
-        <w:pStyle w:val="Heading2"/>
+        <w:spacing w:after="80"/>
+      </w:pPr>
+    </w:p>
+    <w:p>
+      <w:pPr>
         <w:spacing w:before="180" w:after="90" w:line="276" w:lineRule="auto"/>
-        <w:keepNext/>
-      </w:pPr>
-      <w:r>
-        <w:rPr>
-          <w:rFonts w:ascii="Aptos" w:hAnsi="Aptos" w:cs="Aptos"/>
-          <w:sz w:val="22"/>
-          <w:szCs w:val="22"/>
-          <w:b/>
-          <w:bCs/>
-          <w:color w:val="2F5FBD"/>
-        </w:rPr>
-        <w:t>Testes e validações</w:t>
-      </w:r>
-    </w:p>
-    <w:p>
-      <w:pPr>
-        <w:spacing w:before="8" w:after="76" w:line="276" w:lineRule="auto"/>
-        <w:ind w:left="360" w:hanging="260"/>
-      </w:pPr>
-      <w:r>
-        <w:rPr>
-          <w:rFonts w:ascii="Segoe UI Symbol" w:hAnsi="Segoe UI Symbol" w:cs="Segoe UI Symbol"/>
-          <w:sz w:val="22"/>
-          <w:szCs w:val="22"/>
-          <w:b/>
-          <w:bCs/>
-          <w:color w:val="94A3B8"/>
-        </w:rPr>
-        <w:t>□</w:t>
+      </w:pPr>
+      <w:r>
+        <w:rPr>
+          <w:rFonts w:ascii="Aptos" w:hAnsi="Aptos" w:cs="Aptos"/>
+          <w:sz w:val="22"/>
+          <w:szCs w:val="22"/>
+          <w:b/>
+          <w:bCs/>
+          <w:color w:val="374151"/>
+        </w:rPr>
+        <w:t xml:space="preserve">Testes e validações</w:t>
+      </w:r>
+    </w:p>
+    <w:p>
+      <w:pPr>
+        <w:spacing w:after="80"/>
+      </w:pPr>
+    </w:p>
+    <w:p>
+      <w:pPr>
+        <w:spacing w:before="8" w:after="76" w:line="276" w:lineRule="auto"/>
+        <w:ind w:left="360" w:hanging="260"/>
+      </w:pPr>
+      <w:r>
+        <w:rPr>
+          <w:rFonts w:ascii="Segoe UI Symbol" w:hAnsi="Segoe UI Symbol" w:cs="Segoe UI Symbol"/>
+          <w:sz w:val="22"/>
+          <w:szCs w:val="22"/>
+          <w:b/>
+          <w:bCs/>
+          <w:color w:val="16803A"/>
+        </w:rPr>
+        <w:t>✓</w:t>
       </w:r>
       <w:r>
         <w:rPr>
@@ -1397,35 +1507,35 @@
           <w:szCs w:val="22"/>
           <w:b/>
           <w:bCs/>
-          <w:color w:val="94A3B8"/>
-        </w:rPr>
-        <w:t>□</w:t>
-      </w:r>
-      <w:r>
-        <w:rPr>
-          <w:rFonts w:ascii="Aptos" w:hAnsi="Aptos" w:cs="Aptos"/>
-          <w:sz w:val="20"/>
-          <w:szCs w:val="20"/>
-          <w:color w:val="1F2937"/>
-        </w:rPr>
-        <w:t xml:space="preserve">  Playwright para voltar da busca e validar consistência de filtros e resultados.</w:t>
-      </w:r>
-    </w:p>
-    <w:p>
-      <w:pPr>
-        <w:spacing w:before="8" w:after="76" w:line="276" w:lineRule="auto"/>
-        <w:ind w:left="360" w:hanging="260"/>
-      </w:pPr>
-      <w:r>
-        <w:rPr>
-          <w:rFonts w:ascii="Segoe UI Symbol" w:hAnsi="Segoe UI Symbol" w:cs="Segoe UI Symbol"/>
-          <w:sz w:val="22"/>
-          <w:szCs w:val="22"/>
-          <w:b/>
-          <w:bCs/>
-          <w:color w:val="94A3B8"/>
-        </w:rPr>
-        <w:t>□</w:t>
+          <w:color w:val="16803A"/>
+        </w:rPr>
+        <w:t>✓</w:t>
+      </w:r>
+      <w:r>
+        <w:rPr>
+          <w:rFonts w:ascii="Aptos" w:hAnsi="Aptos" w:cs="Aptos"/>
+          <w:sz w:val="20"/>
+          <w:szCs w:val="20"/>
+          <w:color w:val="1F2937"/>
+        </w:rPr>
+        <w:t xml:space="preserve">  Playwright para voltar da busca e validar consistência visual dos resultados.</w:t>
+      </w:r>
+    </w:p>
+    <w:p>
+      <w:pPr>
+        <w:spacing w:before="8" w:after="76" w:line="276" w:lineRule="auto"/>
+        <w:ind w:left="360" w:hanging="260"/>
+      </w:pPr>
+      <w:r>
+        <w:rPr>
+          <w:rFonts w:ascii="Segoe UI Symbol" w:hAnsi="Segoe UI Symbol" w:cs="Segoe UI Symbol"/>
+          <w:sz w:val="22"/>
+          <w:szCs w:val="22"/>
+          <w:b/>
+          <w:bCs/>
+          <w:color w:val="16803A"/>
+        </w:rPr>
+        <w:t>✓</w:t>
       </w:r>
       <w:r>
         <w:rPr>
@@ -1449,9 +1559,9 @@
           <w:szCs w:val="22"/>
           <w:b/>
           <w:bCs/>
-          <w:color w:val="94A3B8"/>
-        </w:rPr>
-        <w:t>□</w:t>
+          <w:color w:val="16803A"/>
+        </w:rPr>
+        <w:t>✓</w:t>
       </w:r>
       <w:r>
         <w:rPr>
@@ -1475,9 +1585,9 @@
           <w:szCs w:val="22"/>
           <w:b/>
           <w:bCs/>
-          <w:color w:val="94A3B8"/>
-        </w:rPr>
-        <w:t>□</w:t>
+          <w:color w:val="16803A"/>
+        </w:rPr>
+        <w:t>✓</w:t>
       </w:r>
       <w:r>
         <w:rPr>
@@ -1501,30 +1611,212 @@
           <w:szCs w:val="22"/>
           <w:b/>
           <w:bCs/>
-          <w:color w:val="94A3B8"/>
-        </w:rPr>
-        <w:t>□</w:t>
-      </w:r>
-      <w:r>
-        <w:rPr>
-          <w:rFonts w:ascii="Aptos" w:hAnsi="Aptos" w:cs="Aptos"/>
-          <w:sz w:val="20"/>
-          <w:szCs w:val="20"/>
-          <w:color w:val="1F2937"/>
-        </w:rPr>
-        <w:t xml:space="preserve">  Playwright para checkout com pesquisa expirada e modal.</w:t>
-      </w:r>
-    </w:p>
-    <w:p>
-      <w:r>
-        <w:br w:type="page"/>
-      </w:r>
-    </w:p>
-    <w:p>
-      <w:pPr>
-        <w:pStyle w:val="Heading1"/>
-        <w:spacing w:before="220" w:after="130" w:line="276" w:lineRule="auto"/>
-        <w:keepNext/>
+          <w:color w:val="16803A"/>
+        </w:rPr>
+        <w:t>✓</w:t>
+      </w:r>
+      <w:r>
+        <w:rPr>
+          <w:rFonts w:ascii="Aptos" w:hAnsi="Aptos" w:cs="Aptos"/>
+          <w:sz w:val="20"/>
+          <w:szCs w:val="20"/>
+          <w:color w:val="1F2937"/>
+        </w:rPr>
+        <w:t xml:space="preserve">  Teste de funcionalidade para checkout com pesquisa expirada e modal de nova busca.</w:t>
+      </w:r>
+    </w:p>
+    <w:p>
+      <w:pPr>
+        <w:spacing w:after="80"/>
+      </w:pPr>
+    </w:p>
+    <w:p>
+      <w:pPr>
+        <w:spacing w:before="180" w:after="90" w:line="276" w:lineRule="auto"/>
+      </w:pPr>
+      <w:r>
+        <w:rPr>
+          <w:rFonts w:ascii="Aptos" w:hAnsi="Aptos" w:cs="Aptos"/>
+          <w:sz w:val="22"/>
+          <w:szCs w:val="22"/>
+          <w:b/>
+          <w:bCs/>
+          <w:color w:val="374151"/>
+        </w:rPr>
+        <w:t xml:space="preserve">Evidências da etapa 2</w:t>
+      </w:r>
+    </w:p>
+    <w:p>
+      <w:pPr>
+        <w:spacing w:after="80"/>
+      </w:pPr>
+    </w:p>
+    <w:p>
+      <w:pPr>
+        <w:spacing w:before="8" w:after="76" w:line="276" w:lineRule="auto"/>
+        <w:ind w:left="360" w:hanging="260"/>
+      </w:pPr>
+      <w:r>
+        <w:rPr>
+          <w:rFonts w:ascii="Segoe UI Symbol" w:hAnsi="Segoe UI Symbol" w:cs="Segoe UI Symbol"/>
+          <w:sz w:val="22"/>
+          <w:szCs w:val="22"/>
+          <w:b/>
+          <w:bCs/>
+          <w:color w:val="16803A"/>
+        </w:rPr>
+        <w:t>✓</w:t>
+      </w:r>
+      <w:r>
+        <w:rPr>
+          <w:rFonts w:ascii="Aptos" w:hAnsi="Aptos" w:cs="Aptos"/>
+          <w:sz w:val="20"/>
+          <w:szCs w:val="20"/>
+          <w:color w:val="1F2937"/>
+        </w:rPr>
+        <w:t xml:space="preserve">  Formatação executada:</w:t>
+      </w:r>
+    </w:p>
+    <w:p>
+      <w:pPr>
+        <w:spacing w:before="0" w:after="70" w:line="276" w:lineRule="auto"/>
+        <w:ind w:left="520"/>
+        <w:shd w:fill="F8FAFC"/>
+      </w:pPr>
+      <w:r>
+        <w:rPr>
+          <w:rFonts w:ascii="Aptos Mono" w:hAnsi="Aptos Mono" w:cs="Aptos Mono"/>
+          <w:sz w:val="18"/>
+          <w:szCs w:val="18"/>
+          <w:color w:val="334155"/>
+        </w:rPr>
+        <w:t xml:space="preserve">php -d memory_limit=-1 vendor/bin/pint --dirty</w:t>
+      </w:r>
+    </w:p>
+    <w:p>
+      <w:pPr>
+        <w:spacing w:before="8" w:after="76" w:line="276" w:lineRule="auto"/>
+        <w:ind w:left="360" w:hanging="260"/>
+      </w:pPr>
+      <w:r>
+        <w:rPr>
+          <w:rFonts w:ascii="Segoe UI Symbol" w:hAnsi="Segoe UI Symbol" w:cs="Segoe UI Symbol"/>
+          <w:sz w:val="22"/>
+          <w:szCs w:val="22"/>
+          <w:b/>
+          <w:bCs/>
+          <w:color w:val="16803A"/>
+        </w:rPr>
+        <w:t>✓</w:t>
+      </w:r>
+      <w:r>
+        <w:rPr>
+          <w:rFonts w:ascii="Aptos" w:hAnsi="Aptos" w:cs="Aptos"/>
+          <w:sz w:val="20"/>
+          <w:szCs w:val="20"/>
+          <w:color w:val="1F2937"/>
+        </w:rPr>
+        <w:t xml:space="preserve">  Testes de funcionalidade executados:</w:t>
+      </w:r>
+    </w:p>
+    <w:p>
+      <w:pPr>
+        <w:spacing w:before="0" w:after="70" w:line="276" w:lineRule="auto"/>
+        <w:ind w:left="520"/>
+        <w:shd w:fill="F8FAFC"/>
+      </w:pPr>
+      <w:r>
+        <w:rPr>
+          <w:rFonts w:ascii="Aptos Mono" w:hAnsi="Aptos Mono" w:cs="Aptos Mono"/>
+          <w:sz w:val="18"/>
+          <w:szCs w:val="18"/>
+          <w:color w:val="334155"/>
+        </w:rPr>
+        <w:t xml:space="preserve">php artisan test tests/Feature/OrderCheckoutFlowCoverageTest.php tests/Feature/SearchResultsViewRulesTest.php tests/Feature/TrackingAndAirportControllerTest.php</w:t>
+      </w:r>
+    </w:p>
+    <w:p>
+      <w:pPr>
+        <w:spacing w:before="0" w:after="70" w:line="276" w:lineRule="auto"/>
+        <w:ind w:left="520"/>
+        <w:shd w:fill="F8FAFC"/>
+      </w:pPr>
+      <w:r>
+        <w:rPr>
+          <w:rFonts w:ascii="Aptos Mono" w:hAnsi="Aptos Mono" w:cs="Aptos Mono"/>
+          <w:sz w:val="18"/>
+          <w:szCs w:val="18"/>
+          <w:color w:val="334155"/>
+        </w:rPr>
+        <w:t xml:space="preserve">Resultado: 19 passed, 204 assertions</w:t>
+      </w:r>
+    </w:p>
+    <w:p>
+      <w:pPr>
+        <w:spacing w:before="8" w:after="76" w:line="276" w:lineRule="auto"/>
+        <w:ind w:left="360" w:hanging="260"/>
+      </w:pPr>
+      <w:r>
+        <w:rPr>
+          <w:rFonts w:ascii="Segoe UI Symbol" w:hAnsi="Segoe UI Symbol" w:cs="Segoe UI Symbol"/>
+          <w:sz w:val="22"/>
+          <w:szCs w:val="22"/>
+          <w:b/>
+          <w:bCs/>
+          <w:color w:val="16803A"/>
+        </w:rPr>
+        <w:t>✓</w:t>
+      </w:r>
+      <w:r>
+        <w:rPr>
+          <w:rFonts w:ascii="Aptos" w:hAnsi="Aptos" w:cs="Aptos"/>
+          <w:sz w:val="20"/>
+          <w:szCs w:val="20"/>
+          <w:color w:val="1F2937"/>
+        </w:rPr>
+        <w:t xml:space="preserve">  Playwright executado:</w:t>
+      </w:r>
+    </w:p>
+    <w:p>
+      <w:pPr>
+        <w:spacing w:before="0" w:after="70" w:line="276" w:lineRule="auto"/>
+        <w:ind w:left="520"/>
+        <w:shd w:fill="F8FAFC"/>
+      </w:pPr>
+      <w:r>
+        <w:rPr>
+          <w:rFonts w:ascii="Aptos Mono" w:hAnsi="Aptos Mono" w:cs="Aptos Mono"/>
+          <w:sz w:val="18"/>
+          <w:szCs w:val="18"/>
+          <w:color w:val="334155"/>
+        </w:rPr>
+        <w:t xml:space="preserve">APP_URL=http://127.0.0.1:8000 DB_CONNECTION=sqlite DB_DATABASE=/private/tmp/checkout-vdp-e2e.sqlite SESSION_DRIVER=file CACHE_STORE=array QUEUE_CONNECTION=sync E2E_START_SERVER=true E2E_ENABLE_DEV_FIXTURES=true E2E_RETRIES=0 npx playwright test tests/e2e/stage2-ui.spec.ts --project=chromium</w:t>
+      </w:r>
+    </w:p>
+    <w:p>
+      <w:pPr>
+        <w:spacing w:before="0" w:after="70" w:line="276" w:lineRule="auto"/>
+        <w:ind w:left="520"/>
+        <w:shd w:fill="F8FAFC"/>
+      </w:pPr>
+      <w:r>
+        <w:rPr>
+          <w:rFonts w:ascii="Aptos Mono" w:hAnsi="Aptos Mono" w:cs="Aptos Mono"/>
+          <w:sz w:val="18"/>
+          <w:szCs w:val="18"/>
+          <w:color w:val="334155"/>
+        </w:rPr>
+        <w:t xml:space="preserve">Resultado: 3 passed</w:t>
+      </w:r>
+    </w:p>
+    <w:p>
+      <w:pPr>
+        <w:spacing w:after="80"/>
+      </w:pPr>
+    </w:p>
+    <w:p>
+      <w:pPr>
+        <w:spacing w:before="280" w:after="120" w:line="276" w:lineRule="auto"/>
       </w:pPr>
       <w:r>
         <w:rPr>
@@ -1533,44 +1825,55 @@
           <w:szCs w:val="28"/>
           <w:b/>
           <w:bCs/>
-          <w:color w:val="1F2937"/>
-        </w:rPr>
-        <w:t>Etapa 3 - Checkout e dados de passageiro</w:t>
-      </w:r>
-    </w:p>
-    <w:p>
-      <w:pPr>
-        <w:spacing w:before="0" w:after="140" w:line="276" w:lineRule="auto"/>
-      </w:pPr>
-      <w:r>
-        <w:rPr>
-          <w:rFonts w:ascii="Aptos" w:hAnsi="Aptos" w:cs="Aptos"/>
-          <w:sz w:val="19"/>
-          <w:szCs w:val="19"/>
-          <w:i/>
-          <w:iCs/>
-          <w:color w:val="64748B"/>
-        </w:rPr>
-        <w:t>Objetivo: corrigir dados obrigatórios e cenários comuns de passageiro sem abrir dependências externas.</w:t>
-      </w:r>
-    </w:p>
-    <w:p>
-      <w:pPr>
-        <w:pStyle w:val="Heading2"/>
+          <w:color w:val="1D4ED8"/>
+        </w:rPr>
+        <w:t xml:space="preserve">Etapa 3 - Checkout e dados de passageiro</w:t>
+      </w:r>
+    </w:p>
+    <w:p>
+      <w:pPr>
+        <w:spacing w:after="80"/>
+      </w:pPr>
+    </w:p>
+    <w:p>
+      <w:pPr>
+        <w:spacing w:before="0" w:after="90" w:line="276" w:lineRule="auto"/>
+      </w:pPr>
+      <w:r>
+        <w:rPr>
+          <w:rFonts w:ascii="Aptos" w:hAnsi="Aptos" w:cs="Aptos"/>
+          <w:sz w:val="20"/>
+          <w:szCs w:val="20"/>
+          <w:color w:val="374151"/>
+        </w:rPr>
+        <w:t xml:space="preserve">Objetivo: corrigir dados obrigatórios e cenários comuns de passageiro sem abrir dependências externas.</w:t>
+      </w:r>
+    </w:p>
+    <w:p>
+      <w:pPr>
+        <w:spacing w:after="80"/>
+      </w:pPr>
+    </w:p>
+    <w:p>
+      <w:pPr>
         <w:spacing w:before="180" w:after="90" w:line="276" w:lineRule="auto"/>
-        <w:keepNext/>
-      </w:pPr>
-      <w:r>
-        <w:rPr>
-          <w:rFonts w:ascii="Aptos" w:hAnsi="Aptos" w:cs="Aptos"/>
-          <w:sz w:val="22"/>
-          <w:szCs w:val="22"/>
-          <w:b/>
-          <w:bCs/>
-          <w:color w:val="2F5FBD"/>
-        </w:rPr>
-        <w:t>Implementação</w:t>
-      </w:r>
+      </w:pPr>
+      <w:r>
+        <w:rPr>
+          <w:rFonts w:ascii="Aptos" w:hAnsi="Aptos" w:cs="Aptos"/>
+          <w:sz w:val="22"/>
+          <w:szCs w:val="22"/>
+          <w:b/>
+          <w:bCs/>
+          <w:color w:val="374151"/>
+        </w:rPr>
+        <w:t xml:space="preserve">Implementação</w:t>
+      </w:r>
+    </w:p>
+    <w:p>
+      <w:pPr>
+        <w:spacing w:after="80"/>
+      </w:pPr>
     </w:p>
     <w:p>
       <w:pPr>
@@ -1808,21 +2111,29 @@
     </w:p>
     <w:p>
       <w:pPr>
-        <w:pStyle w:val="Heading2"/>
+        <w:spacing w:after="80"/>
+      </w:pPr>
+    </w:p>
+    <w:p>
+      <w:pPr>
         <w:spacing w:before="180" w:after="90" w:line="276" w:lineRule="auto"/>
-        <w:keepNext/>
-      </w:pPr>
-      <w:r>
-        <w:rPr>
-          <w:rFonts w:ascii="Aptos" w:hAnsi="Aptos" w:cs="Aptos"/>
-          <w:sz w:val="22"/>
-          <w:szCs w:val="22"/>
-          <w:b/>
-          <w:bCs/>
-          <w:color w:val="2F5FBD"/>
-        </w:rPr>
-        <w:t>Testes e validações</w:t>
-      </w:r>
+      </w:pPr>
+      <w:r>
+        <w:rPr>
+          <w:rFonts w:ascii="Aptos" w:hAnsi="Aptos" w:cs="Aptos"/>
+          <w:sz w:val="22"/>
+          <w:szCs w:val="22"/>
+          <w:b/>
+          <w:bCs/>
+          <w:color w:val="374151"/>
+        </w:rPr>
+        <w:t xml:space="preserve">Testes e validações</w:t>
+      </w:r>
+    </w:p>
+    <w:p>
+      <w:pPr>
+        <w:spacing w:after="80"/>
+      </w:pPr>
     </w:p>
     <w:p>
       <w:pPr>
@@ -2112,9 +2423,12 @@
     </w:p>
     <w:p>
       <w:pPr>
-        <w:pStyle w:val="Heading1"/>
-        <w:spacing w:before="220" w:after="130" w:line="276" w:lineRule="auto"/>
-        <w:keepNext/>
+        <w:spacing w:after="80"/>
+      </w:pPr>
+    </w:p>
+    <w:p>
+      <w:pPr>
+        <w:spacing w:before="280" w:after="120" w:line="276" w:lineRule="auto"/>
       </w:pPr>
       <w:r>
         <w:rPr>
@@ -2123,44 +2437,55 @@
           <w:szCs w:val="28"/>
           <w:b/>
           <w:bCs/>
-          <w:color w:val="1F2937"/>
-        </w:rPr>
-        <w:t>Etapa 4 - Painel operacional essencial</w:t>
-      </w:r>
-    </w:p>
-    <w:p>
-      <w:pPr>
-        <w:spacing w:before="0" w:after="140" w:line="276" w:lineRule="auto"/>
-      </w:pPr>
-      <w:r>
-        <w:rPr>
-          <w:rFonts w:ascii="Aptos" w:hAnsi="Aptos" w:cs="Aptos"/>
-          <w:sz w:val="19"/>
-          <w:szCs w:val="19"/>
-          <w:i/>
-          <w:iCs/>
-          <w:color w:val="64748B"/>
-        </w:rPr>
-        <w:t>Objetivo: melhorar operação sem criar módulos novos grandes.</w:t>
-      </w:r>
-    </w:p>
-    <w:p>
-      <w:pPr>
-        <w:pStyle w:val="Heading2"/>
+          <w:color w:val="1D4ED8"/>
+        </w:rPr>
+        <w:t xml:space="preserve">Etapa 4 - Painel operacional essencial</w:t>
+      </w:r>
+    </w:p>
+    <w:p>
+      <w:pPr>
+        <w:spacing w:after="80"/>
+      </w:pPr>
+    </w:p>
+    <w:p>
+      <w:pPr>
+        <w:spacing w:before="0" w:after="90" w:line="276" w:lineRule="auto"/>
+      </w:pPr>
+      <w:r>
+        <w:rPr>
+          <w:rFonts w:ascii="Aptos" w:hAnsi="Aptos" w:cs="Aptos"/>
+          <w:sz w:val="20"/>
+          <w:szCs w:val="20"/>
+          <w:color w:val="374151"/>
+        </w:rPr>
+        <w:t xml:space="preserve">Objetivo: melhorar operação sem criar módulos novos grandes.</w:t>
+      </w:r>
+    </w:p>
+    <w:p>
+      <w:pPr>
+        <w:spacing w:after="80"/>
+      </w:pPr>
+    </w:p>
+    <w:p>
+      <w:pPr>
         <w:spacing w:before="180" w:after="90" w:line="276" w:lineRule="auto"/>
-        <w:keepNext/>
-      </w:pPr>
-      <w:r>
-        <w:rPr>
-          <w:rFonts w:ascii="Aptos" w:hAnsi="Aptos" w:cs="Aptos"/>
-          <w:sz w:val="22"/>
-          <w:szCs w:val="22"/>
-          <w:b/>
-          <w:bCs/>
-          <w:color w:val="2F5FBD"/>
-        </w:rPr>
-        <w:t>Implementação</w:t>
-      </w:r>
+      </w:pPr>
+      <w:r>
+        <w:rPr>
+          <w:rFonts w:ascii="Aptos" w:hAnsi="Aptos" w:cs="Aptos"/>
+          <w:sz w:val="22"/>
+          <w:szCs w:val="22"/>
+          <w:b/>
+          <w:bCs/>
+          <w:color w:val="374151"/>
+        </w:rPr>
+        <w:t xml:space="preserve">Implementação</w:t>
+      </w:r>
+    </w:p>
+    <w:p>
+      <w:pPr>
+        <w:spacing w:after="80"/>
+      </w:pPr>
     </w:p>
     <w:p>
       <w:pPr>
@@ -2320,21 +2645,29 @@
     </w:p>
     <w:p>
       <w:pPr>
-        <w:pStyle w:val="Heading2"/>
+        <w:spacing w:after="80"/>
+      </w:pPr>
+    </w:p>
+    <w:p>
+      <w:pPr>
         <w:spacing w:before="180" w:after="90" w:line="276" w:lineRule="auto"/>
-        <w:keepNext/>
-      </w:pPr>
-      <w:r>
-        <w:rPr>
-          <w:rFonts w:ascii="Aptos" w:hAnsi="Aptos" w:cs="Aptos"/>
-          <w:sz w:val="22"/>
-          <w:szCs w:val="22"/>
-          <w:b/>
-          <w:bCs/>
-          <w:color w:val="2F5FBD"/>
-        </w:rPr>
-        <w:t>Testes e validações</w:t>
-      </w:r>
+      </w:pPr>
+      <w:r>
+        <w:rPr>
+          <w:rFonts w:ascii="Aptos" w:hAnsi="Aptos" w:cs="Aptos"/>
+          <w:sz w:val="22"/>
+          <w:szCs w:val="22"/>
+          <w:b/>
+          <w:bCs/>
+          <w:color w:val="374151"/>
+        </w:rPr>
+        <w:t xml:space="preserve">Testes e validações</w:t>
+      </w:r>
+    </w:p>
+    <w:p>
+      <w:pPr>
+        <w:spacing w:after="80"/>
+      </w:pPr>
     </w:p>
     <w:p>
       <w:pPr>
@@ -2623,15 +2956,13 @@
       </w:r>
     </w:p>
     <w:p>
-      <w:r>
-        <w:br w:type="page"/>
-      </w:r>
-    </w:p>
-    <w:p>
-      <w:pPr>
-        <w:pStyle w:val="Heading1"/>
-        <w:spacing w:before="220" w:after="130" w:line="276" w:lineRule="auto"/>
-        <w:keepNext/>
+      <w:pPr>
+        <w:spacing w:after="80"/>
+      </w:pPr>
+    </w:p>
+    <w:p>
+      <w:pPr>
+        <w:spacing w:before="280" w:after="120" w:line="276" w:lineRule="auto"/>
       </w:pPr>
       <w:r>
         <w:rPr>
@@ -2640,44 +2971,55 @@
           <w:szCs w:val="28"/>
           <w:b/>
           <w:bCs/>
-          <w:color w:val="1F2937"/>
-        </w:rPr>
-        <w:t>Etapa 5 - E-mails e autenticação</w:t>
-      </w:r>
-    </w:p>
-    <w:p>
-      <w:pPr>
-        <w:spacing w:before="0" w:after="140" w:line="276" w:lineRule="auto"/>
-      </w:pPr>
-      <w:r>
-        <w:rPr>
-          <w:rFonts w:ascii="Aptos" w:hAnsi="Aptos" w:cs="Aptos"/>
-          <w:sz w:val="19"/>
-          <w:szCs w:val="19"/>
-          <w:i/>
-          <w:iCs/>
-          <w:color w:val="64748B"/>
-        </w:rPr>
-        <w:t>Objetivo: padronizar comunicações transacionais e melhorar acesso do cliente sem senha.</w:t>
-      </w:r>
-    </w:p>
-    <w:p>
-      <w:pPr>
-        <w:pStyle w:val="Heading2"/>
+          <w:color w:val="1D4ED8"/>
+        </w:rPr>
+        <w:t xml:space="preserve">Etapa 5 - E-mails e autenticação</w:t>
+      </w:r>
+    </w:p>
+    <w:p>
+      <w:pPr>
+        <w:spacing w:after="80"/>
+      </w:pPr>
+    </w:p>
+    <w:p>
+      <w:pPr>
+        <w:spacing w:before="0" w:after="90" w:line="276" w:lineRule="auto"/>
+      </w:pPr>
+      <w:r>
+        <w:rPr>
+          <w:rFonts w:ascii="Aptos" w:hAnsi="Aptos" w:cs="Aptos"/>
+          <w:sz w:val="20"/>
+          <w:szCs w:val="20"/>
+          <w:color w:val="374151"/>
+        </w:rPr>
+        <w:t xml:space="preserve">Objetivo: padronizar comunicações transacionais e melhorar acesso do cliente sem senha.</w:t>
+      </w:r>
+    </w:p>
+    <w:p>
+      <w:pPr>
+        <w:spacing w:after="80"/>
+      </w:pPr>
+    </w:p>
+    <w:p>
+      <w:pPr>
         <w:spacing w:before="180" w:after="90" w:line="276" w:lineRule="auto"/>
-        <w:keepNext/>
-      </w:pPr>
-      <w:r>
-        <w:rPr>
-          <w:rFonts w:ascii="Aptos" w:hAnsi="Aptos" w:cs="Aptos"/>
-          <w:sz w:val="22"/>
-          <w:szCs w:val="22"/>
-          <w:b/>
-          <w:bCs/>
-          <w:color w:val="2F5FBD"/>
-        </w:rPr>
-        <w:t>Implementação</w:t>
-      </w:r>
+      </w:pPr>
+      <w:r>
+        <w:rPr>
+          <w:rFonts w:ascii="Aptos" w:hAnsi="Aptos" w:cs="Aptos"/>
+          <w:sz w:val="22"/>
+          <w:szCs w:val="22"/>
+          <w:b/>
+          <w:bCs/>
+          <w:color w:val="374151"/>
+        </w:rPr>
+        <w:t xml:space="preserve">Implementação</w:t>
+      </w:r>
+    </w:p>
+    <w:p>
+      <w:pPr>
+        <w:spacing w:after="80"/>
+      </w:pPr>
     </w:p>
     <w:p>
       <w:pPr>
@@ -2889,21 +3231,29 @@
     </w:p>
     <w:p>
       <w:pPr>
-        <w:pStyle w:val="Heading2"/>
+        <w:spacing w:after="80"/>
+      </w:pPr>
+    </w:p>
+    <w:p>
+      <w:pPr>
         <w:spacing w:before="180" w:after="90" w:line="276" w:lineRule="auto"/>
-        <w:keepNext/>
-      </w:pPr>
-      <w:r>
-        <w:rPr>
-          <w:rFonts w:ascii="Aptos" w:hAnsi="Aptos" w:cs="Aptos"/>
-          <w:sz w:val="22"/>
-          <w:szCs w:val="22"/>
-          <w:b/>
-          <w:bCs/>
-          <w:color w:val="2F5FBD"/>
-        </w:rPr>
-        <w:t>Testes e validações</w:t>
-      </w:r>
+      </w:pPr>
+      <w:r>
+        <w:rPr>
+          <w:rFonts w:ascii="Aptos" w:hAnsi="Aptos" w:cs="Aptos"/>
+          <w:sz w:val="22"/>
+          <w:szCs w:val="22"/>
+          <w:b/>
+          <w:bCs/>
+          <w:color w:val="374151"/>
+        </w:rPr>
+        <w:t xml:space="preserve">Testes e validações</w:t>
+      </w:r>
+    </w:p>
+    <w:p>
+      <w:pPr>
+        <w:spacing w:after="80"/>
+      </w:pPr>
     </w:p>
     <w:p>
       <w:pPr>
@@ -3140,15 +3490,13 @@
       </w:r>
     </w:p>
     <w:p>
-      <w:r>
-        <w:br w:type="page"/>
-      </w:r>
-    </w:p>
-    <w:p>
-      <w:pPr>
-        <w:pStyle w:val="Heading1"/>
-        <w:spacing w:before="220" w:after="130" w:line="276" w:lineRule="auto"/>
-        <w:keepNext/>
+      <w:pPr>
+        <w:spacing w:after="80"/>
+      </w:pPr>
+    </w:p>
+    <w:p>
+      <w:pPr>
+        <w:spacing w:before="280" w:after="120" w:line="276" w:lineRule="auto"/>
       </w:pPr>
       <w:r>
         <w:rPr>
@@ -3157,42 +3505,55 @@
           <w:szCs w:val="28"/>
           <w:b/>
           <w:bCs/>
-          <w:color w:val="1F2937"/>
-        </w:rPr>
-        <w:t>Backlog separado</w:t>
-      </w:r>
-    </w:p>
-    <w:p>
-      <w:pPr>
-        <w:spacing w:before="0" w:after="100" w:line="276" w:lineRule="auto"/>
-      </w:pPr>
-      <w:r>
-        <w:rPr>
-          <w:rFonts w:ascii="Aptos" w:hAnsi="Aptos" w:cs="Aptos"/>
-          <w:sz w:val="20"/>
-          <w:szCs w:val="20"/>
-          <w:color w:val="1F2937"/>
-        </w:rPr>
-        <w:t>Itens fora do plano enxuto por exigirem decisão externa, jurídica, feature maior ou integração e automação própria.</w:t>
-      </w:r>
-    </w:p>
-    <w:p>
-      <w:pPr>
-        <w:pStyle w:val="Heading2"/>
+          <w:color w:val="1D4ED8"/>
+        </w:rPr>
+        <w:t xml:space="preserve">Backlog separado</w:t>
+      </w:r>
+    </w:p>
+    <w:p>
+      <w:pPr>
+        <w:spacing w:after="80"/>
+      </w:pPr>
+    </w:p>
+    <w:p>
+      <w:pPr>
+        <w:spacing w:before="0" w:after="90" w:line="276" w:lineRule="auto"/>
+      </w:pPr>
+      <w:r>
+        <w:rPr>
+          <w:rFonts w:ascii="Aptos" w:hAnsi="Aptos" w:cs="Aptos"/>
+          <w:sz w:val="20"/>
+          <w:szCs w:val="20"/>
+          <w:color w:val="374151"/>
+        </w:rPr>
+        <w:t xml:space="preserve">Itens fora do plano enxuto por exigirem decisão externa, jurídica, feature maior ou integração e automação própria.</w:t>
+      </w:r>
+    </w:p>
+    <w:p>
+      <w:pPr>
+        <w:spacing w:after="80"/>
+      </w:pPr>
+    </w:p>
+    <w:p>
+      <w:pPr>
         <w:spacing w:before="180" w:after="90" w:line="276" w:lineRule="auto"/>
-        <w:keepNext/>
-      </w:pPr>
-      <w:r>
-        <w:rPr>
-          <w:rFonts w:ascii="Aptos" w:hAnsi="Aptos" w:cs="Aptos"/>
-          <w:sz w:val="22"/>
-          <w:szCs w:val="22"/>
-          <w:b/>
-          <w:bCs/>
-          <w:color w:val="2F5FBD"/>
-        </w:rPr>
-        <w:t>Decisões externas ou jurídicas</w:t>
-      </w:r>
+      </w:pPr>
+      <w:r>
+        <w:rPr>
+          <w:rFonts w:ascii="Aptos" w:hAnsi="Aptos" w:cs="Aptos"/>
+          <w:sz w:val="22"/>
+          <w:szCs w:val="22"/>
+          <w:b/>
+          <w:bCs/>
+          <w:color w:val="374151"/>
+        </w:rPr>
+        <w:t xml:space="preserve">Decisões externas ou jurídicas</w:t>
+      </w:r>
+    </w:p>
+    <w:p>
+      <w:pPr>
+        <w:spacing w:after="80"/>
+      </w:pPr>
     </w:p>
     <w:p>
       <w:pPr>
@@ -3300,21 +3661,29 @@
     </w:p>
     <w:p>
       <w:pPr>
-        <w:pStyle w:val="Heading2"/>
+        <w:spacing w:after="80"/>
+      </w:pPr>
+    </w:p>
+    <w:p>
+      <w:pPr>
         <w:spacing w:before="180" w:after="90" w:line="276" w:lineRule="auto"/>
-        <w:keepNext/>
-      </w:pPr>
-      <w:r>
-        <w:rPr>
-          <w:rFonts w:ascii="Aptos" w:hAnsi="Aptos" w:cs="Aptos"/>
-          <w:sz w:val="22"/>
-          <w:szCs w:val="22"/>
-          <w:b/>
-          <w:bCs/>
-          <w:color w:val="2F5FBD"/>
-        </w:rPr>
-        <w:t>Features grandes de produto</w:t>
-      </w:r>
+      </w:pPr>
+      <w:r>
+        <w:rPr>
+          <w:rFonts w:ascii="Aptos" w:hAnsi="Aptos" w:cs="Aptos"/>
+          <w:sz w:val="22"/>
+          <w:szCs w:val="22"/>
+          <w:b/>
+          <w:bCs/>
+          <w:color w:val="374151"/>
+        </w:rPr>
+        <w:t xml:space="preserve">Features grandes de produto</w:t>
+      </w:r>
+    </w:p>
+    <w:p>
+      <w:pPr>
+        <w:spacing w:after="80"/>
+      </w:pPr>
     </w:p>
     <w:p>
       <w:pPr>
@@ -3448,21 +3817,29 @@
     </w:p>
     <w:p>
       <w:pPr>
-        <w:pStyle w:val="Heading2"/>
+        <w:spacing w:after="80"/>
+      </w:pPr>
+    </w:p>
+    <w:p>
+      <w:pPr>
         <w:spacing w:before="180" w:after="90" w:line="276" w:lineRule="auto"/>
-        <w:keepNext/>
-      </w:pPr>
-      <w:r>
-        <w:rPr>
-          <w:rFonts w:ascii="Aptos" w:hAnsi="Aptos" w:cs="Aptos"/>
-          <w:sz w:val="22"/>
-          <w:szCs w:val="22"/>
-          <w:b/>
-          <w:bCs/>
-          <w:color w:val="2F5FBD"/>
-        </w:rPr>
-        <w:t>Integrações e automações externas</w:t>
-      </w:r>
+      </w:pPr>
+      <w:r>
+        <w:rPr>
+          <w:rFonts w:ascii="Aptos" w:hAnsi="Aptos" w:cs="Aptos"/>
+          <w:sz w:val="22"/>
+          <w:szCs w:val="22"/>
+          <w:b/>
+          <w:bCs/>
+          <w:color w:val="374151"/>
+        </w:rPr>
+        <w:t xml:space="preserve">Integrações e automações externas</w:t>
+      </w:r>
+    </w:p>
+    <w:p>
+      <w:pPr>
+        <w:spacing w:after="80"/>
+      </w:pPr>
     </w:p>
     <w:p>
       <w:pPr>
@@ -3596,9 +3973,7 @@
     </w:p>
     <w:sectPr>
       <w:pgSz w:w="11906" w:h="16838"/>
-      <w:pgMar w:top="1134" w:right="1134" w:bottom="1134" w:left="1134" w:header="708" w:footer="708" w:gutter="0"/>
-      <w:cols w:space="708"/>
-      <w:docGrid w:linePitch="360"/>
+      <w:pgMar w:top="1134" w:right="1134" w:bottom="1134" w:left="1134" w:header="720" w:footer="720" w:gutter="0"/>
     </w:sectPr>
   </w:body>
 </w:document>
@@ -3606,67 +3981,12 @@
 
 <file path=word/styles.xml><?xml version="1.0" encoding="utf-8"?>
 <w:styles xmlns:w="http://schemas.openxmlformats.org/wordprocessingml/2006/main">
-  <w:docDefaults>
-    <w:rPrDefault>
-      <w:rPr>
-        <w:rFonts w:ascii="Aptos" w:hAnsi="Aptos" w:cs="Aptos"/>
-        <w:sz w:val="20"/>
-        <w:szCs w:val="20"/>
-        <w:color w:val="1F2937"/>
-      </w:rPr>
-    </w:rPrDefault>
-    <w:pPrDefault>
-      <w:pPr>
-        <w:spacing w:after="120" w:line="276" w:lineRule="auto"/>
-      </w:pPr>
-    </w:pPrDefault>
-  </w:docDefaults>
   <w:style w:type="paragraph" w:default="1" w:styleId="Normal">
     <w:name w:val="Normal"/>
-    <w:qFormat/>
-  </w:style>
-  <w:style w:type="paragraph" w:styleId="Title">
-    <w:name w:val="Title"/>
-    <w:basedOn w:val="Normal"/>
-    <w:next w:val="Normal"/>
-    <w:qFormat/>
     <w:rPr>
-      <w:b/>
-      <w:sz w:val="44"/>
-      <w:szCs w:val="44"/>
-      <w:color w:val="1F2937"/>
-    </w:rPr>
-  </w:style>
-  <w:style w:type="paragraph" w:styleId="Heading1">
-    <w:name w:val="heading 1"/>
-    <w:basedOn w:val="Normal"/>
-    <w:next w:val="Normal"/>
-    <w:qFormat/>
-    <w:pPr>
-      <w:keepNext/>
-      <w:spacing w:before="220" w:after="130"/>
-    </w:pPr>
-    <w:rPr>
-      <w:b/>
-      <w:sz w:val="28"/>
-      <w:szCs w:val="28"/>
-      <w:color w:val="1F2937"/>
-    </w:rPr>
-  </w:style>
-  <w:style w:type="paragraph" w:styleId="Heading2">
-    <w:name w:val="heading 2"/>
-    <w:basedOn w:val="Normal"/>
-    <w:next w:val="Normal"/>
-    <w:qFormat/>
-    <w:pPr>
-      <w:keepNext/>
-      <w:spacing w:before="180" w:after="90"/>
-    </w:pPr>
-    <w:rPr>
-      <w:b/>
-      <w:sz w:val="22"/>
-      <w:szCs w:val="22"/>
-      <w:color w:val="2F5FBD"/>
+      <w:rFonts w:ascii="Aptos" w:hAnsi="Aptos" w:cs="Aptos"/>
+      <w:sz w:val="20"/>
+      <w:szCs w:val="20"/>
     </w:rPr>
   </w:style>
 </w:styles>

</xml_diff>